<commit_message>
Update 第二章.docx with manual user edits
</commit_message>
<xml_diff>
--- a/第二章/第二章.docx
+++ b/第二章/第二章.docx
@@ -208,7 +208,8 @@
     <w:p>
       <w:pPr>
         <w:pStyle w:val="a9"/>
-        <w:ind w:hanging="480"/>
+        <w:wordWrap w:val="0"/>
+        <w:ind w:hanging="482"/>
         <w:jc w:val="both"/>
       </w:pPr>
       <w:r>
@@ -21681,6 +21682,29 @@
       <w:szCs w:val="20"/>
     </w:rPr>
   </w:style>
+  <w:style w:type="character" w:styleId="af2">
+    <w:name w:val="Hyperlink"/>
+    <w:basedOn w:val="a0"/>
+    <w:uiPriority w:val="99"/>
+    <w:unhideWhenUsed/>
+    <w:rsid w:val="00331FAE"/>
+    <w:rPr>
+      <w:color w:val="467886" w:themeColor="hyperlink"/>
+      <w:u w:val="single"/>
+    </w:rPr>
+  </w:style>
+  <w:style w:type="character" w:styleId="af3">
+    <w:name w:val="Unresolved Mention"/>
+    <w:basedOn w:val="a0"/>
+    <w:uiPriority w:val="99"/>
+    <w:semiHidden/>
+    <w:unhideWhenUsed/>
+    <w:rsid w:val="00331FAE"/>
+    <w:rPr>
+      <w:color w:val="605E5C"/>
+      <w:shd w:val="clear" w:color="auto" w:fill="E1DFDD"/>
+    </w:rPr>
+  </w:style>
 </w:styles>
 </file>
 

</xml_diff>